<commit_message>
projeto 2 - impacta
</commit_message>
<xml_diff>
--- a/documentos/2402176_RicardoLauton_AC1.docx
+++ b/documentos/2402176_RicardoLauton_AC1.docx
@@ -151,13 +151,24 @@
       </w:r>
       <w:proofErr w:type="gramEnd"/>
       <w:r>
-        <w:t xml:space="preserve"> Reserva de Salas </w:t>
+        <w:t xml:space="preserve"> </w:t>
+      </w:r>
+      <w:r>
+        <w:t xml:space="preserve">Sistema de </w:t>
+      </w:r>
+      <w:r>
+        <w:t>Reserva de Salas</w:t>
+      </w:r>
+      <w:r>
+        <w:t xml:space="preserve"> e Salão</w:t>
+      </w:r>
+      <w:r>
+        <w:t xml:space="preserve"> </w:t>
       </w:r>
       <w:r>
         <w:t xml:space="preserve">para eventos em condomínio </w:t>
       </w:r>
     </w:p>
-    <w:p/>
     <w:p>
       <w:proofErr w:type="gramStart"/>
       <w:r>
@@ -171,7 +182,13 @@
         <w:t xml:space="preserve">modernizar a </w:t>
       </w:r>
       <w:r>
-        <w:t xml:space="preserve">gestão de reserva de Salas de </w:t>
+        <w:t xml:space="preserve">gestão de reserva de Salas </w:t>
+      </w:r>
+      <w:r>
+        <w:t xml:space="preserve">e Salão </w:t>
+      </w:r>
+      <w:r>
+        <w:t xml:space="preserve">de </w:t>
       </w:r>
       <w:proofErr w:type="spellStart"/>
       <w:r>
@@ -189,7 +206,24 @@
     </w:p>
     <w:p>
       <w:r>
-        <w:t xml:space="preserve">O projeto consiste em uma plataforma de gerenciamento de moradores e reservas, focada em organizar o fluxo de informações de um condomínio de forma digital e segura. O sistema substitui as antigas planilhas manuais </w:t>
+        <w:t xml:space="preserve">O projeto consiste em uma plataforma de gerenciamento </w:t>
+      </w:r>
+      <w:r>
+        <w:t xml:space="preserve">de </w:t>
+      </w:r>
+      <w:r>
+        <w:t>reservas</w:t>
+      </w:r>
+      <w:r>
+        <w:t>, dos ambientes compartilhados de Salas de eventos e Salão principal</w:t>
+      </w:r>
+      <w:r>
+        <w:t>, focada em organizar o fluxo de informações de um condomínio de forma digital e segura.</w:t>
+      </w:r>
+    </w:p>
+    <w:p>
+      <w:r>
+        <w:t xml:space="preserve">O sistema substitui as antigas planilhas manuais </w:t>
       </w:r>
       <w:r>
         <w:t xml:space="preserve">de agendamento e controle </w:t>
@@ -197,6 +231,14 @@
       <w:r>
         <w:t>por uma interface web intuitiva conectada a um banco de dados robusto.</w:t>
       </w:r>
+    </w:p>
+    <w:p>
+      <w:pPr>
+        <w:rPr>
+          <w:b/>
+          <w:bCs/>
+        </w:rPr>
+      </w:pPr>
     </w:p>
     <w:p>
       <w:proofErr w:type="spellStart"/>
@@ -360,7 +402,58 @@
           <w:b/>
           <w:bCs/>
         </w:rPr>
-        <w:t xml:space="preserve"> tela principal de opções e Cadastro de moradores. </w:t>
+        <w:t xml:space="preserve"> tela principal </w:t>
+      </w:r>
+      <w:r>
+        <w:rPr>
+          <w:b/>
+          <w:bCs/>
+        </w:rPr>
+        <w:t>do sistema e</w:t>
+      </w:r>
+      <w:r>
+        <w:rPr>
+          <w:b/>
+          <w:bCs/>
+        </w:rPr>
+        <w:t xml:space="preserve"> </w:t>
+      </w:r>
+      <w:r>
+        <w:rPr>
+          <w:b/>
+          <w:bCs/>
+        </w:rPr>
+        <w:t xml:space="preserve">funcionalidades do </w:t>
+      </w:r>
+      <w:proofErr w:type="spellStart"/>
+      <w:r>
+        <w:rPr>
+          <w:b/>
+          <w:bCs/>
+        </w:rPr>
+        <w:t>primeito</w:t>
+      </w:r>
+      <w:proofErr w:type="spellEnd"/>
+      <w:r>
+        <w:rPr>
+          <w:b/>
+          <w:bCs/>
+        </w:rPr>
+        <w:t xml:space="preserve"> botão, </w:t>
+      </w:r>
+      <w:r>
+        <w:rPr>
+          <w:b/>
+          <w:bCs/>
+        </w:rPr>
+        <w:t>Cadastro de moradores</w:t>
+      </w:r>
+      <w:r>
+        <w:rPr>
+          <w:b/>
+          <w:bCs/>
+        </w:rPr>
+        <w:t xml:space="preserve">, permitindo incluir, alterar e excluir os moradores, além de mostrar os moradores já cadastrados em uma listagem visual. </w:t>
       </w:r>
     </w:p>
     <w:p/>
@@ -375,8 +468,9 @@
       <w:r>
         <w:t>Board:</w:t>
       </w:r>
-    </w:p>
-    <w:p>
+      <w:r>
+        <w:t xml:space="preserve"> </w:t>
+      </w:r>
       <w:hyperlink r:id="rId4" w:history="1">
         <w:r>
           <w:rPr>
@@ -386,7 +480,6 @@
         </w:r>
       </w:hyperlink>
     </w:p>
-    <w:p/>
     <w:p>
       <w:proofErr w:type="spellStart"/>
       <w:r>
@@ -402,8 +495,9 @@
       <w:r>
         <w:t>GitHub:</w:t>
       </w:r>
-    </w:p>
-    <w:p>
+      <w:r>
+        <w:t xml:space="preserve"> </w:t>
+      </w:r>
       <w:hyperlink r:id="rId5" w:history="1">
         <w:r>
           <w:rPr>
@@ -413,7 +507,6 @@
         </w:r>
       </w:hyperlink>
     </w:p>
-    <w:p/>
     <w:p>
       <w:proofErr w:type="spellStart"/>
       <w:r>
@@ -434,9 +527,10 @@
         </w:r>
       </w:hyperlink>
     </w:p>
+    <w:p/>
     <w:sectPr>
       <w:pgSz w:w="11906" w:h="16838"/>
-      <w:pgMar w:top="1417" w:right="1701" w:bottom="1417" w:left="1701" w:header="708" w:footer="708" w:gutter="0"/>
+      <w:pgMar w:top="993" w:right="1701" w:bottom="1417" w:left="1701" w:header="708" w:footer="708" w:gutter="0"/>
       <w:cols w:space="708"/>
       <w:docGrid w:linePitch="360"/>
     </w:sectPr>

</xml_diff>